<commit_message>
Updated intro/methods, rearranged results, updated many tables/graphics.
</commit_message>
<xml_diff>
--- a/custom-reference-doc.docx
+++ b/custom-reference-doc.docx
@@ -418,6 +418,22 @@
       <w:sz w:val="22"/>
     </w:rPr>
   </w:style>
+  <w:style w:type="paragraph" w:styleId="Caption">
+    <w:name w:val="Caption"/>
+    <w:basedOn w:val="Normal"/>
+    <w:rPr>
+      <w:sz w:val="20"/>
+      <w:szCs w:val="20"/>
+    </w:rPr>
+  </w:style>
+  <w:style w:type="paragraph" w:customStyle="1" w:styleId="ImageCaption">
+    <w:name w:val="Image Caption"/>
+    <w:basedOn w:val="Caption"/>
+  </w:style>
+  <w:style w:type="paragraph" w:customStyle="1" w:styleId="TableCaption">
+    <w:name w:val="Table Caption"/>
+    <w:basedOn w:val="Caption"/>
+  </w:style>
   <w:style w:type="paragraph" w:styleId="Heading1">
     <w:name w:val="heading 1"/>
     <w:basedOn w:val="Normal"/>

</xml_diff>

<commit_message>
Update aquatic units to µm/L.; Various changes to text, added wordcount extension.
</commit_message>
<xml_diff>
--- a/custom-reference-doc.docx
+++ b/custom-reference-doc.docx
@@ -4,6 +4,7 @@
   <w:body>
     <w:p/>
     <w:sectPr>
+      <w:footerReference w:type="default" r:id="rId6"/>
       <w:pgSz w:w="11906" w:h="16838"/>
       <w:pgMar w:top="1440" w:right="1440" w:bottom="1440" w:left="1440" w:header="720" w:footer="720" w:gutter="0"/>
       <w:cols w:space="720"/>
@@ -11,6 +12,98 @@
     </w:sectPr>
   </w:body>
 </w:document>
+</file>
+
+<file path=word/endnotes.xml><?xml version="1.0" encoding="utf-8"?>
+<w:endnotes xmlns:wpc="http://schemas.microsoft.com/office/word/2010/wordprocessingCanvas" xmlns:cx="http://schemas.microsoft.com/office/drawing/2014/chartex" xmlns:cx1="http://schemas.microsoft.com/office/drawing/2015/9/8/chartex" xmlns:cx2="http://schemas.microsoft.com/office/drawing/2015/10/21/chartex" xmlns:cx3="http://schemas.microsoft.com/office/drawing/2016/5/9/chartex" xmlns:cx4="http://schemas.microsoft.com/office/drawing/2016/5/10/chartex" xmlns:cx5="http://schemas.microsoft.com/office/drawing/2016/5/11/chartex" xmlns:cx6="http://schemas.microsoft.com/office/drawing/2016/5/12/chartex" xmlns:cx7="http://schemas.microsoft.com/office/drawing/2016/5/13/chartex" xmlns:cx8="http://schemas.microsoft.com/office/drawing/2016/5/14/chartex" xmlns:mc="http://schemas.openxmlformats.org/markup-compatibility/2006" xmlns:aink="http://schemas.microsoft.com/office/drawing/2016/ink" xmlns:am3d="http://schemas.microsoft.com/office/drawing/2017/model3d" xmlns:o="urn:schemas-microsoft-com:office:office" xmlns:oel="http://schemas.microsoft.com/office/2019/extlst" xmlns:r="http://schemas.openxmlformats.org/officeDocument/2006/relationships" xmlns:m="http://schemas.openxmlformats.org/officeDocument/2006/math" xmlns:v="urn:schemas-microsoft-com:vml" xmlns:wp14="http://schemas.microsoft.com/office/word/2010/wordprocessingDrawing" xmlns:wp="http://schemas.openxmlformats.org/drawingml/2006/wordprocessingDrawing" xmlns:w10="urn:schemas-microsoft-com:office:word" xmlns:w="http://schemas.openxmlformats.org/wordprocessingml/2006/main" xmlns:w14="http://schemas.microsoft.com/office/word/2010/wordml" xmlns:w15="http://schemas.microsoft.com/office/word/2012/wordml" xmlns:w16cex="http://schemas.microsoft.com/office/word/2018/wordml/cex" xmlns:w16cid="http://schemas.microsoft.com/office/word/2016/wordml/cid" xmlns:w16="http://schemas.microsoft.com/office/word/2018/wordml" xmlns:w16du="http://schemas.microsoft.com/office/word/2023/wordml/word16du" xmlns:w16sdtdh="http://schemas.microsoft.com/office/word/2020/wordml/sdtdatahash" xmlns:w16sdtfl="http://schemas.microsoft.com/office/word/2024/wordml/sdtformatlock" xmlns:w16se="http://schemas.microsoft.com/office/word/2015/wordml/symex" xmlns:wpg="http://schemas.microsoft.com/office/word/2010/wordprocessingGroup" xmlns:wpi="http://schemas.microsoft.com/office/word/2010/wordprocessingInk" xmlns:wne="http://schemas.microsoft.com/office/word/2006/wordml" xmlns:wps="http://schemas.microsoft.com/office/word/2010/wordprocessingShape" mc:Ignorable="w14 w15 w16se w16cid w16 w16cex w16sdtdh w16sdtfl w16du wp14">
+  <w:endnote w:type="separator" w:id="-1">
+    <w:p>
+      <w:pPr>
+        <w:spacing w:before="0" w:after="0" w:line="240" w:lineRule="auto"/>
+      </w:pPr>
+      <w:r>
+        <w:separator/>
+      </w:r>
+    </w:p>
+  </w:endnote>
+  <w:endnote w:type="continuationSeparator" w:id="0">
+    <w:p>
+      <w:pPr>
+        <w:spacing w:before="0" w:after="0" w:line="240" w:lineRule="auto"/>
+      </w:pPr>
+      <w:r>
+        <w:continuationSeparator/>
+      </w:r>
+    </w:p>
+  </w:endnote>
+</w:endnotes>
+</file>
+
+<file path=word/footer1.xml><?xml version="1.0" encoding="utf-8"?>
+<w:ftr xmlns:wpc="http://schemas.microsoft.com/office/word/2010/wordprocessingCanvas" xmlns:cx="http://schemas.microsoft.com/office/drawing/2014/chartex" xmlns:cx1="http://schemas.microsoft.com/office/drawing/2015/9/8/chartex" xmlns:cx2="http://schemas.microsoft.com/office/drawing/2015/10/21/chartex" xmlns:cx3="http://schemas.microsoft.com/office/drawing/2016/5/9/chartex" xmlns:cx4="http://schemas.microsoft.com/office/drawing/2016/5/10/chartex" xmlns:cx5="http://schemas.microsoft.com/office/drawing/2016/5/11/chartex" xmlns:cx6="http://schemas.microsoft.com/office/drawing/2016/5/12/chartex" xmlns:cx7="http://schemas.microsoft.com/office/drawing/2016/5/13/chartex" xmlns:cx8="http://schemas.microsoft.com/office/drawing/2016/5/14/chartex" xmlns:mc="http://schemas.openxmlformats.org/markup-compatibility/2006" xmlns:aink="http://schemas.microsoft.com/office/drawing/2016/ink" xmlns:am3d="http://schemas.microsoft.com/office/drawing/2017/model3d" xmlns:o="urn:schemas-microsoft-com:office:office" xmlns:oel="http://schemas.microsoft.com/office/2019/extlst" xmlns:r="http://schemas.openxmlformats.org/officeDocument/2006/relationships" xmlns:m="http://schemas.openxmlformats.org/officeDocument/2006/math" xmlns:v="urn:schemas-microsoft-com:vml" xmlns:wp14="http://schemas.microsoft.com/office/word/2010/wordprocessingDrawing" xmlns:wp="http://schemas.openxmlformats.org/drawingml/2006/wordprocessingDrawing" xmlns:w10="urn:schemas-microsoft-com:office:word" xmlns:w="http://schemas.openxmlformats.org/wordprocessingml/2006/main" xmlns:w14="http://schemas.microsoft.com/office/word/2010/wordml" xmlns:w15="http://schemas.microsoft.com/office/word/2012/wordml" xmlns:w16cex="http://schemas.microsoft.com/office/word/2018/wordml/cex" xmlns:w16cid="http://schemas.microsoft.com/office/word/2016/wordml/cid" xmlns:w16="http://schemas.microsoft.com/office/word/2018/wordml" xmlns:w16du="http://schemas.microsoft.com/office/word/2023/wordml/word16du" xmlns:w16sdtdh="http://schemas.microsoft.com/office/word/2020/wordml/sdtdatahash" xmlns:w16sdtfl="http://schemas.microsoft.com/office/word/2024/wordml/sdtformatlock" xmlns:w16se="http://schemas.microsoft.com/office/word/2015/wordml/symex" xmlns:wpg="http://schemas.microsoft.com/office/word/2010/wordprocessingGroup" xmlns:wpi="http://schemas.microsoft.com/office/word/2010/wordprocessingInk" xmlns:wne="http://schemas.microsoft.com/office/word/2006/wordml" xmlns:wps="http://schemas.microsoft.com/office/word/2010/wordprocessingShape" mc:Ignorable="w14 w15 w16se w16cid w16 w16cex w16sdtdh w16sdtfl w16du wp14">
+  <w:sdt>
+    <w:sdtPr>
+      <w:id w:val="761573199"/>
+      <w:docPartObj>
+        <w:docPartGallery w:val="Page Numbers (Bottom of Page)"/>
+        <w:docPartUnique/>
+      </w:docPartObj>
+    </w:sdtPr>
+    <w:sdtContent>
+      <w:p>
+        <w:pPr>
+          <w:pStyle w:val="Footer"/>
+          <w:jc w:val="center"/>
+        </w:pPr>
+        <w:r>
+          <w:fldChar w:fldCharType="begin"/>
+        </w:r>
+        <w:r>
+          <w:instrText>PAGE   \* MERGEFORMAT</w:instrText>
+        </w:r>
+        <w:r>
+          <w:fldChar w:fldCharType="separate"/>
+        </w:r>
+        <w:r>
+          <w:t>2</w:t>
+        </w:r>
+        <w:r>
+          <w:fldChar w:fldCharType="end"/>
+        </w:r>
+      </w:p>
+    </w:sdtContent>
+  </w:sdt>
+  <w:p>
+    <w:pPr>
+      <w:pStyle w:val="Footer"/>
+    </w:pPr>
+  </w:p>
+</w:ftr>
+</file>
+
+<file path=word/footnotes.xml><?xml version="1.0" encoding="utf-8"?>
+<w:footnotes xmlns:wpc="http://schemas.microsoft.com/office/word/2010/wordprocessingCanvas" xmlns:cx="http://schemas.microsoft.com/office/drawing/2014/chartex" xmlns:cx1="http://schemas.microsoft.com/office/drawing/2015/9/8/chartex" xmlns:cx2="http://schemas.microsoft.com/office/drawing/2015/10/21/chartex" xmlns:cx3="http://schemas.microsoft.com/office/drawing/2016/5/9/chartex" xmlns:cx4="http://schemas.microsoft.com/office/drawing/2016/5/10/chartex" xmlns:cx5="http://schemas.microsoft.com/office/drawing/2016/5/11/chartex" xmlns:cx6="http://schemas.microsoft.com/office/drawing/2016/5/12/chartex" xmlns:cx7="http://schemas.microsoft.com/office/drawing/2016/5/13/chartex" xmlns:cx8="http://schemas.microsoft.com/office/drawing/2016/5/14/chartex" xmlns:mc="http://schemas.openxmlformats.org/markup-compatibility/2006" xmlns:aink="http://schemas.microsoft.com/office/drawing/2016/ink" xmlns:am3d="http://schemas.microsoft.com/office/drawing/2017/model3d" xmlns:o="urn:schemas-microsoft-com:office:office" xmlns:oel="http://schemas.microsoft.com/office/2019/extlst" xmlns:r="http://schemas.openxmlformats.org/officeDocument/2006/relationships" xmlns:m="http://schemas.openxmlformats.org/officeDocument/2006/math" xmlns:v="urn:schemas-microsoft-com:vml" xmlns:wp14="http://schemas.microsoft.com/office/word/2010/wordprocessingDrawing" xmlns:wp="http://schemas.openxmlformats.org/drawingml/2006/wordprocessingDrawing" xmlns:w10="urn:schemas-microsoft-com:office:word" xmlns:w="http://schemas.openxmlformats.org/wordprocessingml/2006/main" xmlns:w14="http://schemas.microsoft.com/office/word/2010/wordml" xmlns:w15="http://schemas.microsoft.com/office/word/2012/wordml" xmlns:w16cex="http://schemas.microsoft.com/office/word/2018/wordml/cex" xmlns:w16cid="http://schemas.microsoft.com/office/word/2016/wordml/cid" xmlns:w16="http://schemas.microsoft.com/office/word/2018/wordml" xmlns:w16du="http://schemas.microsoft.com/office/word/2023/wordml/word16du" xmlns:w16sdtdh="http://schemas.microsoft.com/office/word/2020/wordml/sdtdatahash" xmlns:w16sdtfl="http://schemas.microsoft.com/office/word/2024/wordml/sdtformatlock" xmlns:w16se="http://schemas.microsoft.com/office/word/2015/wordml/symex" xmlns:wpg="http://schemas.microsoft.com/office/word/2010/wordprocessingGroup" xmlns:wpi="http://schemas.microsoft.com/office/word/2010/wordprocessingInk" xmlns:wne="http://schemas.microsoft.com/office/word/2006/wordml" xmlns:wps="http://schemas.microsoft.com/office/word/2010/wordprocessingShape" mc:Ignorable="w14 w15 w16se w16cid w16 w16cex w16sdtdh w16sdtfl w16du wp14">
+  <w:footnote w:type="separator" w:id="-1">
+    <w:p>
+      <w:pPr>
+        <w:spacing w:before="0" w:after="0" w:line="240" w:lineRule="auto"/>
+      </w:pPr>
+      <w:r>
+        <w:separator/>
+      </w:r>
+    </w:p>
+  </w:footnote>
+  <w:footnote w:type="continuationSeparator" w:id="0">
+    <w:p>
+      <w:pPr>
+        <w:spacing w:before="0" w:after="0" w:line="240" w:lineRule="auto"/>
+      </w:pPr>
+      <w:r>
+        <w:continuationSeparator/>
+      </w:r>
+    </w:p>
+  </w:footnote>
+</w:footnotes>
 </file>
 
 <file path=word/styles.xml><?xml version="1.0" encoding="utf-8"?>
@@ -414,25 +507,12 @@
     <w:name w:val="Normal"/>
     <w:qFormat/>
     <w:rsid w:val="00FD5955"/>
+    <w:pPr>
+      <w:spacing w:before="160"/>
+    </w:pPr>
     <w:rPr>
       <w:sz w:val="22"/>
     </w:rPr>
-  </w:style>
-  <w:style w:type="paragraph" w:styleId="Caption">
-    <w:name w:val="Caption"/>
-    <w:basedOn w:val="Normal"/>
-    <w:rPr>
-      <w:sz w:val="20"/>
-      <w:szCs w:val="20"/>
-    </w:rPr>
-  </w:style>
-  <w:style w:type="paragraph" w:customStyle="1" w:styleId="ImageCaption">
-    <w:name w:val="Image Caption"/>
-    <w:basedOn w:val="Caption"/>
-  </w:style>
-  <w:style w:type="paragraph" w:customStyle="1" w:styleId="TableCaption">
-    <w:name w:val="Table Caption"/>
-    <w:basedOn w:val="Caption"/>
   </w:style>
   <w:style w:type="paragraph" w:styleId="Heading1">
     <w:name w:val="heading 1"/>
@@ -468,7 +548,7 @@
     <w:pPr>
       <w:keepNext/>
       <w:keepLines/>
-      <w:spacing w:before="160" w:after="80"/>
+      <w:spacing w:after="80"/>
       <w:outlineLvl w:val="1"/>
     </w:pPr>
     <w:rPr>
@@ -491,7 +571,7 @@
     <w:pPr>
       <w:keepNext/>
       <w:keepLines/>
-      <w:spacing w:before="160" w:after="80"/>
+      <w:spacing w:after="80"/>
       <w:outlineLvl w:val="2"/>
     </w:pPr>
     <w:rPr>
@@ -636,6 +716,7 @@
   <w:style w:type="character" w:default="1" w:styleId="DefaultParagraphFont">
     <w:name w:val="Default Paragraph Font"/>
     <w:uiPriority w:val="1"/>
+    <w:semiHidden/>
     <w:unhideWhenUsed/>
   </w:style>
   <w:style w:type="table" w:default="1" w:styleId="TableNormal">
@@ -659,6 +740,22 @@
     <w:semiHidden/>
     <w:unhideWhenUsed/>
   </w:style>
+  <w:style w:type="paragraph" w:styleId="Caption">
+    <w:name w:val="caption"/>
+    <w:basedOn w:val="Normal"/>
+    <w:rPr>
+      <w:sz w:val="20"/>
+      <w:szCs w:val="20"/>
+    </w:rPr>
+  </w:style>
+  <w:style w:type="paragraph" w:customStyle="1" w:styleId="ImageCaption">
+    <w:name w:val="Image Caption"/>
+    <w:basedOn w:val="Caption"/>
+  </w:style>
+  <w:style w:type="paragraph" w:customStyle="1" w:styleId="TableCaption">
+    <w:name w:val="Table Caption"/>
+    <w:basedOn w:val="Caption"/>
+  </w:style>
   <w:style w:type="character" w:customStyle="1" w:styleId="Heading1Char">
     <w:name w:val="Heading 1 Char"/>
     <w:basedOn w:val="DefaultParagraphFont"/>
@@ -856,7 +953,6 @@
     <w:qFormat/>
     <w:rsid w:val="00D06449"/>
     <w:pPr>
-      <w:spacing w:before="160"/>
       <w:jc w:val="center"/>
     </w:pPr>
     <w:rPr>
@@ -947,6 +1043,56 @@
       <w:smallCaps/>
       <w:color w:val="0F4761" w:themeColor="accent1" w:themeShade="BF"/>
       <w:spacing w:val="5"/>
+    </w:rPr>
+  </w:style>
+  <w:style w:type="paragraph" w:styleId="Header">
+    <w:name w:val="header"/>
+    <w:basedOn w:val="Normal"/>
+    <w:link w:val="HeaderChar"/>
+    <w:uiPriority w:val="99"/>
+    <w:unhideWhenUsed/>
+    <w:rsid w:val="0005422F"/>
+    <w:pPr>
+      <w:tabs>
+        <w:tab w:val="center" w:pos="4513"/>
+        <w:tab w:val="right" w:pos="9026"/>
+      </w:tabs>
+      <w:spacing w:before="0" w:after="0" w:line="240" w:lineRule="auto"/>
+    </w:pPr>
+  </w:style>
+  <w:style w:type="character" w:customStyle="1" w:styleId="HeaderChar">
+    <w:name w:val="Header Char"/>
+    <w:basedOn w:val="DefaultParagraphFont"/>
+    <w:link w:val="Header"/>
+    <w:uiPriority w:val="99"/>
+    <w:rsid w:val="0005422F"/>
+    <w:rPr>
+      <w:sz w:val="22"/>
+    </w:rPr>
+  </w:style>
+  <w:style w:type="paragraph" w:styleId="Footer">
+    <w:name w:val="footer"/>
+    <w:basedOn w:val="Normal"/>
+    <w:link w:val="FooterChar"/>
+    <w:uiPriority w:val="99"/>
+    <w:unhideWhenUsed/>
+    <w:rsid w:val="0005422F"/>
+    <w:pPr>
+      <w:tabs>
+        <w:tab w:val="center" w:pos="4513"/>
+        <w:tab w:val="right" w:pos="9026"/>
+      </w:tabs>
+      <w:spacing w:before="0" w:after="0" w:line="240" w:lineRule="auto"/>
+    </w:pPr>
+  </w:style>
+  <w:style w:type="character" w:customStyle="1" w:styleId="FooterChar">
+    <w:name w:val="Footer Char"/>
+    <w:basedOn w:val="DefaultParagraphFont"/>
+    <w:link w:val="Footer"/>
+    <w:uiPriority w:val="99"/>
+    <w:rsid w:val="0005422F"/>
+    <w:rPr>
+      <w:sz w:val="22"/>
     </w:rPr>
   </w:style>
 </w:styles>

</xml_diff>